<commit_message>
Met à jour la formation ANPER : mixte, repas, total 3,5 M FCFA
Intègre format mixte, restauration, contacts anperniger.org,
et plafonne le total TTC à 3 500 000 FCFA (vols exclus).

Co-authored-by: NigerCertify-offensive-lab <openaiabou@gmail.com>
</commit_message>
<xml_diff>
--- a/offres/proposition-formation-anper-community-manager.docx
+++ b/offres/proposition-formation-anper-community-manager.docx
@@ -16,14 +16,14 @@
         </w:tblBorders>
       </w:tblPr>
       <w:tblGrid>
-        <w:gridCol w:w="3364"/>
-        <w:gridCol w:w="3364"/>
-        <w:gridCol w:w="3364"/>
+        <w:gridCol w:w="3402"/>
+        <w:gridCol w:w="3402"/>
+        <w:gridCol w:w="3402"/>
       </w:tblGrid>
       <w:tr>
         <w:tc>
           <w:tcPr>
-            <w:tcW w:type="dxa" w:w="3364"/>
+            <w:tcW w:type="dxa" w:w="3402"/>
           </w:tcPr>
           <w:p>
             <w:pPr>
@@ -68,7 +68,7 @@
         </w:tc>
         <w:tc>
           <w:tcPr>
-            <w:tcW w:type="dxa" w:w="3364"/>
+            <w:tcW w:type="dxa" w:w="3402"/>
           </w:tcPr>
           <w:p>
             <w:pPr>
@@ -79,7 +79,6 @@
               <w:rPr>
                 <w:rFonts w:ascii="Calibri" w:hAnsi="Calibri"/>
                 <w:b/>
-                <w:i w:val="0"/>
                 <w:color w:val="FF7900"/>
                 <w:sz w:val="24"/>
               </w:rPr>
@@ -89,7 +88,6 @@
               <w:rPr>
                 <w:rFonts w:ascii="Calibri" w:hAnsi="Calibri"/>
                 <w:b/>
-                <w:i w:val="0"/>
                 <w:color w:val="0055D2"/>
                 <w:sz w:val="24"/>
               </w:rPr>
@@ -104,7 +102,6 @@
               <w:rPr>
                 <w:rFonts w:ascii="Calibri" w:hAnsi="Calibri"/>
                 <w:b w:val="0"/>
-                <w:i w:val="0"/>
                 <w:color w:val="00224B"/>
                 <w:sz w:val="20"/>
               </w:rPr>
@@ -119,7 +116,6 @@
               <w:rPr>
                 <w:rFonts w:ascii="Calibri" w:hAnsi="Calibri"/>
                 <w:b w:val="0"/>
-                <w:i w:val="0"/>
                 <w:color w:val="00224B"/>
                 <w:sz w:val="20"/>
               </w:rPr>
@@ -129,7 +125,7 @@
         </w:tc>
         <w:tc>
           <w:tcPr>
-            <w:tcW w:type="dxa" w:w="3364"/>
+            <w:tcW w:type="dxa" w:w="3402"/>
           </w:tcPr>
           <w:p>
             <w:r/>
@@ -142,9 +138,8 @@
               <w:rPr>
                 <w:rFonts w:ascii="Calibri" w:hAnsi="Calibri"/>
                 <w:b/>
-                <w:i w:val="0"/>
                 <w:color w:val="00224B"/>
-                <w:sz w:val="20"/>
+                <w:sz w:val="18"/>
               </w:rPr>
               <w:t>Date: 25/08/2026</w:t>
             </w:r>
@@ -157,11 +152,10 @@
               <w:rPr>
                 <w:rFonts w:ascii="Calibri" w:hAnsi="Calibri"/>
                 <w:b/>
-                <w:i w:val="0"/>
                 <w:color w:val="00224B"/>
-                <w:sz w:val="20"/>
+                <w:sz w:val="18"/>
               </w:rPr>
-              <w:t>Proforma: 00006</w:t>
+              <w:t>Téléphone: 20 35 01 73</w:t>
             </w:r>
           </w:p>
           <w:p>
@@ -172,11 +166,10 @@
               <w:rPr>
                 <w:rFonts w:ascii="Calibri" w:hAnsi="Calibri"/>
                 <w:b/>
-                <w:i w:val="0"/>
                 <w:color w:val="00224B"/>
-                <w:sz w:val="20"/>
+                <w:sz w:val="18"/>
               </w:rPr>
-              <w:t>Client: ANPER NIGER</w:t>
+              <w:t>Email: info@anperniger.org</w:t>
             </w:r>
           </w:p>
         </w:tc>
@@ -184,34 +177,46 @@
     </w:tbl>
     <w:p>
       <w:pPr>
-        <w:spacing w:before="240" w:after="40"/>
+        <w:spacing w:before="80" w:after="40"/>
+      </w:pPr>
+      <w:r>
+        <w:rPr>
+          <w:rFonts w:ascii="Calibri" w:hAnsi="Calibri"/>
+          <w:b/>
+          <w:color w:val="00224B"/>
+          <w:sz w:val="22"/>
+        </w:rPr>
+        <w:t>Proforma: 00006    Client: ANPER NIGER</w:t>
+      </w:r>
+    </w:p>
+    <w:p>
+      <w:pPr>
+        <w:spacing w:before="160" w:after="40"/>
         <w:jc w:val="center"/>
       </w:pPr>
       <w:r>
         <w:rPr>
           <w:rFonts w:ascii="Calibri" w:hAnsi="Calibri"/>
           <w:b/>
-          <w:i w:val="0"/>
           <w:color w:val="E36C09"/>
-          <w:sz w:val="36"/>
+          <w:sz w:val="32"/>
         </w:rPr>
         <w:t>Proposition de formation — Community Manager</w:t>
       </w:r>
     </w:p>
     <w:p>
       <w:pPr>
-        <w:spacing w:before="0" w:after="200"/>
+        <w:spacing w:before="0" w:after="160"/>
         <w:jc w:val="center"/>
       </w:pPr>
       <w:r>
         <w:rPr>
           <w:rFonts w:ascii="Calibri" w:hAnsi="Calibri"/>
           <w:b/>
-          <w:i w:val="0"/>
           <w:color w:val="00224B"/>
-          <w:sz w:val="22"/>
+          <w:sz w:val="20"/>
         </w:rPr>
-        <w:t>1 participant · Présentiel · Lomé · Hébergement inclus · 15–26/09/2026</w:t>
+        <w:t>1 participant · Mixte (présentiel Lomé + visio) · Hébergement &amp; restauration inclus · 15–26/09/2026</w:t>
       </w:r>
     </w:p>
     <w:tbl>
@@ -228,28 +233,27 @@
         </w:tblBorders>
       </w:tblPr>
       <w:tblGrid>
-        <w:gridCol w:w="2523"/>
-        <w:gridCol w:w="2523"/>
-        <w:gridCol w:w="2523"/>
-        <w:gridCol w:w="2523"/>
+        <w:gridCol w:w="2551"/>
+        <w:gridCol w:w="2551"/>
+        <w:gridCol w:w="2551"/>
+        <w:gridCol w:w="2551"/>
       </w:tblGrid>
       <w:tr>
         <w:tc>
           <w:tcPr>
-            <w:tcW w:type="dxa" w:w="2523"/>
+            <w:tcW w:type="dxa" w:w="2551"/>
           </w:tcPr>
           <w:p>
             <w:pPr>
-              <w:spacing w:before="40" w:after="40"/>
+              <w:spacing w:before="20" w:after="20"/>
             </w:pPr>
             <w:r/>
             <w:r>
               <w:rPr>
                 <w:rFonts w:ascii="Calibri" w:hAnsi="Calibri"/>
                 <w:b/>
-                <w:i w:val="0"/>
                 <w:color w:val="00224B"/>
-                <w:sz w:val="20"/>
+                <w:sz w:val="18"/>
               </w:rPr>
               <w:t>Profil:</w:t>
             </w:r>
@@ -257,20 +261,18 @@
         </w:tc>
         <w:tc>
           <w:tcPr>
-            <w:tcW w:type="dxa" w:w="2523"/>
+            <w:tcW w:type="dxa" w:w="2551"/>
           </w:tcPr>
           <w:p>
             <w:pPr>
-              <w:spacing w:before="40" w:after="40"/>
+              <w:spacing w:before="20" w:after="20"/>
             </w:pPr>
             <w:r/>
             <w:r>
               <w:rPr>
                 <w:rFonts w:ascii="Calibri" w:hAnsi="Calibri"/>
                 <w:b w:val="0"/>
-                <w:i w:val="0"/>
-                <w:color w:val="000000"/>
-                <w:sz w:val="20"/>
+                <w:sz w:val="18"/>
               </w:rPr>
               <w:t>Community Manager</w:t>
             </w:r>
@@ -278,20 +280,19 @@
         </w:tc>
         <w:tc>
           <w:tcPr>
-            <w:tcW w:type="dxa" w:w="2523"/>
+            <w:tcW w:type="dxa" w:w="2551"/>
           </w:tcPr>
           <w:p>
             <w:pPr>
-              <w:spacing w:before="40" w:after="40"/>
+              <w:spacing w:before="20" w:after="20"/>
             </w:pPr>
             <w:r/>
             <w:r>
               <w:rPr>
                 <w:rFonts w:ascii="Calibri" w:hAnsi="Calibri"/>
                 <w:b/>
-                <w:i w:val="0"/>
                 <w:color w:val="00224B"/>
-                <w:sz w:val="20"/>
+                <w:sz w:val="18"/>
               </w:rPr>
               <w:t>Effectif:</w:t>
             </w:r>
@@ -299,20 +300,18 @@
         </w:tc>
         <w:tc>
           <w:tcPr>
-            <w:tcW w:type="dxa" w:w="2523"/>
+            <w:tcW w:type="dxa" w:w="2551"/>
           </w:tcPr>
           <w:p>
             <w:pPr>
-              <w:spacing w:before="40" w:after="40"/>
+              <w:spacing w:before="20" w:after="20"/>
             </w:pPr>
             <w:r/>
             <w:r>
               <w:rPr>
                 <w:rFonts w:ascii="Calibri" w:hAnsi="Calibri"/>
                 <w:b w:val="0"/>
-                <w:i w:val="0"/>
-                <w:color w:val="000000"/>
-                <w:sz w:val="20"/>
+                <w:sz w:val="18"/>
               </w:rPr>
               <w:t>1 personne</w:t>
             </w:r>
@@ -322,20 +321,19 @@
       <w:tr>
         <w:tc>
           <w:tcPr>
-            <w:tcW w:type="dxa" w:w="2523"/>
+            <w:tcW w:type="dxa" w:w="2551"/>
           </w:tcPr>
           <w:p>
             <w:pPr>
-              <w:spacing w:before="40" w:after="40"/>
+              <w:spacing w:before="20" w:after="20"/>
             </w:pPr>
             <w:r/>
             <w:r>
               <w:rPr>
                 <w:rFonts w:ascii="Calibri" w:hAnsi="Calibri"/>
                 <w:b/>
-                <w:i w:val="0"/>
                 <w:color w:val="00224B"/>
-                <w:sz w:val="20"/>
+                <w:sz w:val="18"/>
               </w:rPr>
               <w:t>Durée:</w:t>
             </w:r>
@@ -343,20 +341,18 @@
         </w:tc>
         <w:tc>
           <w:tcPr>
-            <w:tcW w:type="dxa" w:w="2523"/>
+            <w:tcW w:type="dxa" w:w="2551"/>
           </w:tcPr>
           <w:p>
             <w:pPr>
-              <w:spacing w:before="40" w:after="40"/>
+              <w:spacing w:before="20" w:after="20"/>
             </w:pPr>
             <w:r/>
             <w:r>
               <w:rPr>
                 <w:rFonts w:ascii="Calibri" w:hAnsi="Calibri"/>
                 <w:b w:val="0"/>
-                <w:i w:val="0"/>
-                <w:color w:val="000000"/>
-                <w:sz w:val="20"/>
+                <w:sz w:val="18"/>
               </w:rPr>
               <w:t>2 semaines / 70 h</w:t>
             </w:r>
@@ -364,43 +360,40 @@
         </w:tc>
         <w:tc>
           <w:tcPr>
-            <w:tcW w:type="dxa" w:w="2523"/>
+            <w:tcW w:type="dxa" w:w="2551"/>
           </w:tcPr>
           <w:p>
             <w:pPr>
-              <w:spacing w:before="40" w:after="40"/>
+              <w:spacing w:before="20" w:after="20"/>
             </w:pPr>
             <w:r/>
             <w:r>
               <w:rPr>
                 <w:rFonts w:ascii="Calibri" w:hAnsi="Calibri"/>
                 <w:b/>
-                <w:i w:val="0"/>
                 <w:color w:val="00224B"/>
-                <w:sz w:val="20"/>
+                <w:sz w:val="18"/>
               </w:rPr>
-              <w:t>Lieu:</w:t>
+              <w:t>Modalité:</w:t>
             </w:r>
           </w:p>
         </w:tc>
         <w:tc>
           <w:tcPr>
-            <w:tcW w:type="dxa" w:w="2523"/>
+            <w:tcW w:type="dxa" w:w="2551"/>
           </w:tcPr>
           <w:p>
             <w:pPr>
-              <w:spacing w:before="40" w:after="40"/>
+              <w:spacing w:before="20" w:after="20"/>
             </w:pPr>
             <w:r/>
             <w:r>
               <w:rPr>
                 <w:rFonts w:ascii="Calibri" w:hAnsi="Calibri"/>
                 <w:b w:val="0"/>
-                <w:i w:val="0"/>
-                <w:color w:val="000000"/>
-                <w:sz w:val="20"/>
+                <w:sz w:val="18"/>
               </w:rPr>
-              <w:t>Lomé, Togo</w:t>
+              <w:t>Mixte</w:t>
             </w:r>
           </w:p>
         </w:tc>
@@ -408,85 +401,79 @@
       <w:tr>
         <w:tc>
           <w:tcPr>
-            <w:tcW w:type="dxa" w:w="2523"/>
+            <w:tcW w:type="dxa" w:w="2551"/>
           </w:tcPr>
           <w:p>
             <w:pPr>
-              <w:spacing w:before="40" w:after="40"/>
+              <w:spacing w:before="20" w:after="20"/>
             </w:pPr>
             <w:r/>
             <w:r>
               <w:rPr>
                 <w:rFonts w:ascii="Calibri" w:hAnsi="Calibri"/>
                 <w:b/>
-                <w:i w:val="0"/>
                 <w:color w:val="00224B"/>
-                <w:sz w:val="20"/>
+                <w:sz w:val="18"/>
               </w:rPr>
-              <w:t>Début:</w:t>
+              <w:t>Lieu présentiel:</w:t>
             </w:r>
           </w:p>
         </w:tc>
         <w:tc>
           <w:tcPr>
-            <w:tcW w:type="dxa" w:w="2523"/>
+            <w:tcW w:type="dxa" w:w="2551"/>
           </w:tcPr>
           <w:p>
             <w:pPr>
-              <w:spacing w:before="40" w:after="40"/>
+              <w:spacing w:before="20" w:after="20"/>
             </w:pPr>
             <w:r/>
             <w:r>
               <w:rPr>
                 <w:rFonts w:ascii="Calibri" w:hAnsi="Calibri"/>
                 <w:b w:val="0"/>
-                <w:i w:val="0"/>
-                <w:color w:val="000000"/>
-                <w:sz w:val="20"/>
+                <w:sz w:val="18"/>
               </w:rPr>
-              <w:t>15/09/2026</w:t>
+              <w:t>Lomé, Togo</w:t>
             </w:r>
           </w:p>
         </w:tc>
         <w:tc>
           <w:tcPr>
-            <w:tcW w:type="dxa" w:w="2523"/>
+            <w:tcW w:type="dxa" w:w="2551"/>
           </w:tcPr>
           <w:p>
             <w:pPr>
-              <w:spacing w:before="40" w:after="40"/>
+              <w:spacing w:before="20" w:after="20"/>
             </w:pPr>
             <w:r/>
             <w:r>
               <w:rPr>
                 <w:rFonts w:ascii="Calibri" w:hAnsi="Calibri"/>
                 <w:b/>
-                <w:i w:val="0"/>
                 <w:color w:val="00224B"/>
-                <w:sz w:val="20"/>
+                <w:sz w:val="18"/>
               </w:rPr>
-              <w:t>Fin prévue:</w:t>
+              <w:t>Début / Fin:</w:t>
             </w:r>
           </w:p>
         </w:tc>
         <w:tc>
           <w:tcPr>
-            <w:tcW w:type="dxa" w:w="2523"/>
+            <w:tcW w:type="dxa" w:w="2551"/>
           </w:tcPr>
           <w:p>
             <w:pPr>
-              <w:spacing w:before="40" w:after="40"/>
+              <w:spacing w:before="20" w:after="20"/>
             </w:pPr>
             <w:r/>
             <w:r>
               <w:rPr>
                 <w:rFonts w:ascii="Calibri" w:hAnsi="Calibri"/>
                 <w:b w:val="0"/>
-                <w:i w:val="0"/>
-                <w:color w:val="000000"/>
-                <w:sz w:val="20"/>
+                <w:sz w:val="18"/>
               </w:rPr>
-              <w:t>26/09/2026</w:t>
+              <w:t>15–26/09/2026</w:t>
             </w:r>
           </w:p>
         </w:tc>
@@ -494,85 +481,79 @@
       <w:tr>
         <w:tc>
           <w:tcPr>
-            <w:tcW w:type="dxa" w:w="2523"/>
+            <w:tcW w:type="dxa" w:w="2551"/>
           </w:tcPr>
           <w:p>
             <w:pPr>
-              <w:spacing w:before="40" w:after="40"/>
+              <w:spacing w:before="20" w:after="20"/>
             </w:pPr>
             <w:r/>
             <w:r>
               <w:rPr>
                 <w:rFonts w:ascii="Calibri" w:hAnsi="Calibri"/>
                 <w:b/>
-                <w:i w:val="0"/>
                 <w:color w:val="00224B"/>
-                <w:sz w:val="20"/>
+                <w:sz w:val="18"/>
               </w:rPr>
-              <w:t>Hébergement:</w:t>
+              <w:t>Hébergement + repas:</w:t>
             </w:r>
           </w:p>
         </w:tc>
         <w:tc>
           <w:tcPr>
-            <w:tcW w:type="dxa" w:w="2523"/>
+            <w:tcW w:type="dxa" w:w="2551"/>
           </w:tcPr>
           <w:p>
             <w:pPr>
-              <w:spacing w:before="40" w:after="40"/>
+              <w:spacing w:before="20" w:after="20"/>
             </w:pPr>
             <w:r/>
             <w:r>
               <w:rPr>
                 <w:rFonts w:ascii="Calibri" w:hAnsi="Calibri"/>
                 <w:b w:val="0"/>
-                <w:i w:val="0"/>
-                <w:color w:val="000000"/>
-                <w:sz w:val="20"/>
+                <w:sz w:val="18"/>
               </w:rPr>
-              <w:t>Inclus — 14 nuits + petit-déj.</w:t>
+              <w:t>Inclus</w:t>
             </w:r>
           </w:p>
         </w:tc>
         <w:tc>
           <w:tcPr>
-            <w:tcW w:type="dxa" w:w="2523"/>
+            <w:tcW w:type="dxa" w:w="2551"/>
           </w:tcPr>
           <w:p>
             <w:pPr>
-              <w:spacing w:before="40" w:after="40"/>
+              <w:spacing w:before="20" w:after="20"/>
             </w:pPr>
             <w:r/>
             <w:r>
               <w:rPr>
                 <w:rFonts w:ascii="Calibri" w:hAnsi="Calibri"/>
                 <w:b/>
-                <w:i w:val="0"/>
                 <w:color w:val="00224B"/>
-                <w:sz w:val="20"/>
+                <w:sz w:val="18"/>
               </w:rPr>
-              <w:t>Langue:</w:t>
+              <w:t>Vols A/R:</w:t>
             </w:r>
           </w:p>
         </w:tc>
         <w:tc>
           <w:tcPr>
-            <w:tcW w:type="dxa" w:w="2523"/>
+            <w:tcW w:type="dxa" w:w="2551"/>
           </w:tcPr>
           <w:p>
             <w:pPr>
-              <w:spacing w:before="40" w:after="40"/>
+              <w:spacing w:before="20" w:after="20"/>
             </w:pPr>
             <w:r/>
             <w:r>
               <w:rPr>
                 <w:rFonts w:ascii="Calibri" w:hAnsi="Calibri"/>
                 <w:b w:val="0"/>
-                <w:i w:val="0"/>
-                <w:color w:val="000000"/>
-                <w:sz w:val="20"/>
+                <w:sz w:val="18"/>
               </w:rPr>
-              <w:t>Français</w:t>
+              <w:t>Non inclus</w:t>
             </w:r>
           </w:p>
         </w:tc>
@@ -580,7 +561,7 @@
     </w:tbl>
     <w:p>
       <w:pPr>
-        <w:spacing w:before="160" w:after="80"/>
+        <w:spacing w:before="120" w:after="60"/>
       </w:pPr>
     </w:p>
     <w:tbl>
@@ -597,18 +578,18 @@
         </w:tblBorders>
       </w:tblPr>
       <w:tblGrid>
-        <w:gridCol w:w="5046"/>
-        <w:gridCol w:w="5046"/>
+        <w:gridCol w:w="5103"/>
+        <w:gridCol w:w="5103"/>
       </w:tblGrid>
       <w:tr>
         <w:tc>
           <w:tcPr>
-            <w:tcW w:type="dxa" w:w="5046"/>
+            <w:tcW w:type="dxa" w:w="5103"/>
             <w:shd w:fill="E46C0A" w:val="clear"/>
           </w:tcPr>
           <w:p>
             <w:pPr>
-              <w:spacing w:before="100" w:after="100"/>
+              <w:spacing w:before="80" w:after="80"/>
               <w:jc w:val="left"/>
             </w:pPr>
             <w:r/>
@@ -616,9 +597,8 @@
               <w:rPr>
                 <w:rFonts w:ascii="Calibri" w:hAnsi="Calibri"/>
                 <w:b/>
-                <w:i w:val="0"/>
                 <w:color w:val="FFFFFF"/>
-                <w:sz w:val="24"/>
+                <w:sz w:val="22"/>
               </w:rPr>
               <w:t>Prestations</w:t>
             </w:r>
@@ -626,12 +606,12 @@
         </w:tc>
         <w:tc>
           <w:tcPr>
-            <w:tcW w:type="dxa" w:w="5046"/>
+            <w:tcW w:type="dxa" w:w="5103"/>
             <w:shd w:fill="E46C0A" w:val="clear"/>
           </w:tcPr>
           <w:p>
             <w:pPr>
-              <w:spacing w:before="100" w:after="100"/>
+              <w:spacing w:before="80" w:after="80"/>
               <w:jc w:val="center"/>
             </w:pPr>
             <w:r/>
@@ -639,9 +619,8 @@
               <w:rPr>
                 <w:rFonts w:ascii="Calibri" w:hAnsi="Calibri"/>
                 <w:b/>
-                <w:i w:val="0"/>
                 <w:color w:val="FFFFFF"/>
-                <w:sz w:val="24"/>
+                <w:sz w:val="22"/>
               </w:rPr>
               <w:t>Montant (FCFA)</w:t>
             </w:r>
@@ -651,31 +630,30 @@
       <w:tr>
         <w:tc>
           <w:tcPr>
-            <w:tcW w:type="dxa" w:w="5046"/>
+            <w:tcW w:type="dxa" w:w="5103"/>
           </w:tcPr>
           <w:p>
             <w:pPr>
-              <w:spacing w:before="80" w:after="80"/>
+              <w:spacing w:before="60" w:after="60"/>
             </w:pPr>
             <w:r/>
             <w:r>
               <w:rPr>
                 <w:rFonts w:ascii="Calibri" w:hAnsi="Calibri"/>
                 <w:b w:val="0"/>
-                <w:i w:val="0"/>
-                <w:sz w:val="20"/>
+                <w:sz w:val="18"/>
               </w:rPr>
-              <w:t>Formation Community Manager — 10 jours / 70 h (stratégie, contenus, community care, reporting, crise)</w:t>
+              <w:t>Formation Community Manager mixte — 10 jours / 70 h (présentiel Lomé + sessions visio, coaching live)</w:t>
             </w:r>
           </w:p>
         </w:tc>
         <w:tc>
           <w:tcPr>
-            <w:tcW w:type="dxa" w:w="5046"/>
+            <w:tcW w:type="dxa" w:w="5103"/>
           </w:tcPr>
           <w:p>
             <w:pPr>
-              <w:spacing w:before="80" w:after="80"/>
+              <w:spacing w:before="60" w:after="60"/>
               <w:jc w:val="right"/>
             </w:pPr>
             <w:r/>
@@ -683,10 +661,9 @@
               <w:rPr>
                 <w:rFonts w:ascii="Calibri" w:hAnsi="Calibri"/>
                 <w:b w:val="0"/>
-                <w:i w:val="0"/>
-                <w:sz w:val="20"/>
+                <w:sz w:val="18"/>
               </w:rPr>
-              <w:t>950 000</w:t>
+              <w:t>1 500 000</w:t>
             </w:r>
           </w:p>
         </w:tc>
@@ -694,31 +671,30 @@
       <w:tr>
         <w:tc>
           <w:tcPr>
-            <w:tcW w:type="dxa" w:w="5046"/>
+            <w:tcW w:type="dxa" w:w="5103"/>
           </w:tcPr>
           <w:p>
             <w:pPr>
-              <w:spacing w:before="80" w:after="80"/>
+              <w:spacing w:before="60" w:after="60"/>
             </w:pPr>
             <w:r/>
             <w:r>
               <w:rPr>
                 <w:rFonts w:ascii="Calibri" w:hAnsi="Calibri"/>
                 <w:b w:val="0"/>
-                <w:i w:val="0"/>
-                <w:sz w:val="20"/>
+                <w:sz w:val="18"/>
               </w:rPr>
-              <w:t>Supports pédagogiques, ateliers pratiques &amp; attestation de formation</w:t>
+              <w:t>Supports pédagogiques, plateforme virtuelle, ateliers pratiques &amp; attestation</w:t>
             </w:r>
           </w:p>
         </w:tc>
         <w:tc>
           <w:tcPr>
-            <w:tcW w:type="dxa" w:w="5046"/>
+            <w:tcW w:type="dxa" w:w="5103"/>
           </w:tcPr>
           <w:p>
             <w:pPr>
-              <w:spacing w:before="80" w:after="80"/>
+              <w:spacing w:before="60" w:after="60"/>
               <w:jc w:val="right"/>
             </w:pPr>
             <w:r/>
@@ -726,10 +702,9 @@
               <w:rPr>
                 <w:rFonts w:ascii="Calibri" w:hAnsi="Calibri"/>
                 <w:b w:val="0"/>
-                <w:i w:val="0"/>
-                <w:sz w:val="20"/>
+                <w:sz w:val="18"/>
               </w:rPr>
-              <w:t>100 000</w:t>
+              <w:t>250 000</w:t>
             </w:r>
           </w:p>
         </w:tc>
@@ -737,19 +712,18 @@
       <w:tr>
         <w:tc>
           <w:tcPr>
-            <w:tcW w:type="dxa" w:w="5046"/>
+            <w:tcW w:type="dxa" w:w="5103"/>
           </w:tcPr>
           <w:p>
             <w:pPr>
-              <w:spacing w:before="80" w:after="80"/>
+              <w:spacing w:before="60" w:after="60"/>
             </w:pPr>
             <w:r/>
             <w:r>
               <w:rPr>
                 <w:rFonts w:ascii="Calibri" w:hAnsi="Calibri"/>
                 <w:b w:val="0"/>
-                <w:i w:val="0"/>
-                <w:sz w:val="20"/>
+                <w:sz w:val="18"/>
               </w:rPr>
               <w:t>Hébergement 14 nuits à Lomé (hôtel affaires, petit-déjeuner inclus)</w:t>
             </w:r>
@@ -757,11 +731,11 @@
         </w:tc>
         <w:tc>
           <w:tcPr>
-            <w:tcW w:type="dxa" w:w="5046"/>
+            <w:tcW w:type="dxa" w:w="5103"/>
           </w:tcPr>
           <w:p>
             <w:pPr>
-              <w:spacing w:before="80" w:after="80"/>
+              <w:spacing w:before="60" w:after="60"/>
               <w:jc w:val="right"/>
             </w:pPr>
             <w:r/>
@@ -769,8 +743,7 @@
               <w:rPr>
                 <w:rFonts w:ascii="Calibri" w:hAnsi="Calibri"/>
                 <w:b w:val="0"/>
-                <w:i w:val="0"/>
-                <w:sz w:val="20"/>
+                <w:sz w:val="18"/>
               </w:rPr>
               <w:t>700 000</w:t>
             </w:r>
@@ -780,19 +753,59 @@
       <w:tr>
         <w:tc>
           <w:tcPr>
-            <w:tcW w:type="dxa" w:w="5046"/>
+            <w:tcW w:type="dxa" w:w="5103"/>
           </w:tcPr>
           <w:p>
             <w:pPr>
-              <w:spacing w:before="80" w:after="80"/>
+              <w:spacing w:before="60" w:after="60"/>
             </w:pPr>
             <w:r/>
             <w:r>
               <w:rPr>
                 <w:rFonts w:ascii="Calibri" w:hAnsi="Calibri"/>
                 <w:b w:val="0"/>
-                <w:i w:val="0"/>
-                <w:sz w:val="20"/>
+                <w:sz w:val="18"/>
+              </w:rPr>
+              <w:t>Restauration complète (déjeuner + dîner) — 14 jours</w:t>
+            </w:r>
+          </w:p>
+        </w:tc>
+        <w:tc>
+          <w:tcPr>
+            <w:tcW w:type="dxa" w:w="5103"/>
+          </w:tcPr>
+          <w:p>
+            <w:pPr>
+              <w:spacing w:before="60" w:after="60"/>
+              <w:jc w:val="right"/>
+            </w:pPr>
+            <w:r/>
+            <w:r>
+              <w:rPr>
+                <w:rFonts w:ascii="Calibri" w:hAnsi="Calibri"/>
+                <w:b w:val="0"/>
+                <w:sz w:val="18"/>
+              </w:rPr>
+              <w:t>560 000</w:t>
+            </w:r>
+          </w:p>
+        </w:tc>
+      </w:tr>
+      <w:tr>
+        <w:tc>
+          <w:tcPr>
+            <w:tcW w:type="dxa" w:w="5103"/>
+          </w:tcPr>
+          <w:p>
+            <w:pPr>
+              <w:spacing w:before="60" w:after="60"/>
+            </w:pPr>
+            <w:r/>
+            <w:r>
+              <w:rPr>
+                <w:rFonts w:ascii="Calibri" w:hAnsi="Calibri"/>
+                <w:b w:val="0"/>
+                <w:sz w:val="18"/>
               </w:rPr>
               <w:t>Coordination pédagogique, logistique locale &amp; suivi post-formation (30 jours)</w:t>
             </w:r>
@@ -800,11 +813,11 @@
         </w:tc>
         <w:tc>
           <w:tcPr>
-            <w:tcW w:type="dxa" w:w="5046"/>
+            <w:tcW w:type="dxa" w:w="5103"/>
           </w:tcPr>
           <w:p>
             <w:pPr>
-              <w:spacing w:before="80" w:after="80"/>
+              <w:spacing w:before="60" w:after="60"/>
               <w:jc w:val="right"/>
             </w:pPr>
             <w:r/>
@@ -812,10 +825,9 @@
               <w:rPr>
                 <w:rFonts w:ascii="Calibri" w:hAnsi="Calibri"/>
                 <w:b w:val="0"/>
-                <w:i w:val="0"/>
-                <w:sz w:val="20"/>
+                <w:sz w:val="18"/>
               </w:rPr>
-              <w:t>100 000</w:t>
+              <w:t>490 000</w:t>
             </w:r>
           </w:p>
         </w:tc>
@@ -823,19 +835,18 @@
       <w:tr>
         <w:tc>
           <w:tcPr>
-            <w:tcW w:type="dxa" w:w="5046"/>
+            <w:tcW w:type="dxa" w:w="5103"/>
           </w:tcPr>
           <w:p>
             <w:pPr>
-              <w:spacing w:before="80" w:after="80"/>
+              <w:spacing w:before="60" w:after="60"/>
             </w:pPr>
             <w:r/>
             <w:r>
               <w:rPr>
                 <w:rFonts w:ascii="Calibri" w:hAnsi="Calibri"/>
                 <w:b/>
-                <w:i w:val="0"/>
-                <w:sz w:val="20"/>
+                <w:sz w:val="18"/>
               </w:rPr>
               <w:t>TOTAL TTC</w:t>
             </w:r>
@@ -843,11 +854,11 @@
         </w:tc>
         <w:tc>
           <w:tcPr>
-            <w:tcW w:type="dxa" w:w="5046"/>
+            <w:tcW w:type="dxa" w:w="5103"/>
           </w:tcPr>
           <w:p>
             <w:pPr>
-              <w:spacing w:before="80" w:after="80"/>
+              <w:spacing w:before="60" w:after="60"/>
               <w:jc w:val="right"/>
             </w:pPr>
             <w:r/>
@@ -855,10 +866,9 @@
               <w:rPr>
                 <w:rFonts w:ascii="Calibri" w:hAnsi="Calibri"/>
                 <w:b/>
-                <w:i w:val="0"/>
-                <w:sz w:val="20"/>
+                <w:sz w:val="18"/>
               </w:rPr>
-              <w:t>1 850 000</w:t>
+              <w:t>3 500 000</w:t>
             </w:r>
           </w:p>
         </w:tc>
@@ -866,7 +876,7 @@
     </w:tbl>
     <w:p>
       <w:pPr>
-        <w:spacing w:before="160" w:after="80"/>
+        <w:spacing w:before="120" w:after="60"/>
       </w:pPr>
     </w:p>
     <w:tbl>
@@ -883,25 +893,24 @@
         </w:tblBorders>
       </w:tblPr>
       <w:tblGrid>
-        <w:gridCol w:w="5046"/>
-        <w:gridCol w:w="5046"/>
+        <w:gridCol w:w="5103"/>
+        <w:gridCol w:w="5103"/>
       </w:tblGrid>
       <w:tr>
         <w:tc>
           <w:tcPr>
-            <w:tcW w:type="dxa" w:w="5046"/>
+            <w:tcW w:type="dxa" w:w="5103"/>
           </w:tcPr>
           <w:p>
             <w:pPr>
-              <w:spacing w:before="60" w:after="60"/>
+              <w:spacing w:before="40" w:after="40"/>
             </w:pPr>
             <w:r/>
             <w:r>
               <w:rPr>
                 <w:rFonts w:ascii="Calibri" w:hAnsi="Calibri"/>
                 <w:b/>
-                <w:i w:val="0"/>
-                <w:sz w:val="22"/>
+                <w:sz w:val="20"/>
               </w:rPr>
               <w:t>Montant HT</w:t>
             </w:r>
@@ -909,21 +918,20 @@
         </w:tc>
         <w:tc>
           <w:tcPr>
-            <w:tcW w:type="dxa" w:w="5046"/>
+            <w:tcW w:type="dxa" w:w="5103"/>
           </w:tcPr>
           <w:p>
             <w:pPr>
-              <w:spacing w:before="60" w:after="60"/>
+              <w:spacing w:before="40" w:after="40"/>
             </w:pPr>
             <w:r/>
             <w:r>
               <w:rPr>
                 <w:rFonts w:ascii="Calibri" w:hAnsi="Calibri"/>
                 <w:b w:val="0"/>
-                <w:i w:val="0"/>
-                <w:sz w:val="22"/>
+                <w:sz w:val="20"/>
               </w:rPr>
-              <w:t>1 850 000</w:t>
+              <w:t>3 500 000</w:t>
             </w:r>
           </w:p>
         </w:tc>
@@ -931,19 +939,18 @@
       <w:tr>
         <w:tc>
           <w:tcPr>
-            <w:tcW w:type="dxa" w:w="5046"/>
+            <w:tcW w:type="dxa" w:w="5103"/>
           </w:tcPr>
           <w:p>
             <w:pPr>
-              <w:spacing w:before="60" w:after="60"/>
+              <w:spacing w:before="40" w:after="40"/>
             </w:pPr>
             <w:r/>
             <w:r>
               <w:rPr>
                 <w:rFonts w:ascii="Calibri" w:hAnsi="Calibri"/>
                 <w:b/>
-                <w:i w:val="0"/>
-                <w:sz w:val="22"/>
+                <w:sz w:val="20"/>
               </w:rPr>
               <w:t>ISB (2%)</w:t>
             </w:r>
@@ -951,21 +958,20 @@
         </w:tc>
         <w:tc>
           <w:tcPr>
-            <w:tcW w:type="dxa" w:w="5046"/>
+            <w:tcW w:type="dxa" w:w="5103"/>
           </w:tcPr>
           <w:p>
             <w:pPr>
-              <w:spacing w:before="60" w:after="60"/>
+              <w:spacing w:before="40" w:after="40"/>
             </w:pPr>
             <w:r/>
             <w:r>
               <w:rPr>
                 <w:rFonts w:ascii="Calibri" w:hAnsi="Calibri"/>
                 <w:b w:val="0"/>
-                <w:i w:val="0"/>
-                <w:sz w:val="22"/>
+                <w:sz w:val="20"/>
               </w:rPr>
-              <w:t>37 000</w:t>
+              <w:t>70 000</w:t>
             </w:r>
           </w:p>
         </w:tc>
@@ -973,19 +979,18 @@
       <w:tr>
         <w:tc>
           <w:tcPr>
-            <w:tcW w:type="dxa" w:w="5046"/>
+            <w:tcW w:type="dxa" w:w="5103"/>
           </w:tcPr>
           <w:p>
             <w:pPr>
-              <w:spacing w:before="60" w:after="60"/>
+              <w:spacing w:before="40" w:after="40"/>
             </w:pPr>
             <w:r/>
             <w:r>
               <w:rPr>
                 <w:rFonts w:ascii="Calibri" w:hAnsi="Calibri"/>
                 <w:b/>
-                <w:i w:val="0"/>
-                <w:sz w:val="22"/>
+                <w:sz w:val="20"/>
               </w:rPr>
               <w:t>Net à payer TTC :</w:t>
             </w:r>
@@ -993,21 +998,20 @@
         </w:tc>
         <w:tc>
           <w:tcPr>
-            <w:tcW w:type="dxa" w:w="5046"/>
+            <w:tcW w:type="dxa" w:w="5103"/>
           </w:tcPr>
           <w:p>
             <w:pPr>
-              <w:spacing w:before="60" w:after="60"/>
+              <w:spacing w:before="40" w:after="40"/>
             </w:pPr>
             <w:r/>
             <w:r>
               <w:rPr>
                 <w:rFonts w:ascii="Calibri" w:hAnsi="Calibri"/>
                 <w:b/>
-                <w:i w:val="0"/>
-                <w:sz w:val="22"/>
+                <w:sz w:val="20"/>
               </w:rPr>
-              <w:t>1 850 000</w:t>
+              <w:t>3 500 000</w:t>
             </w:r>
           </w:p>
         </w:tc>
@@ -1015,45 +1019,29 @@
     </w:tbl>
     <w:p>
       <w:pPr>
-        <w:spacing w:before="200" w:after="80"/>
+        <w:spacing w:before="160" w:after="60"/>
       </w:pPr>
       <w:r>
         <w:rPr>
           <w:rFonts w:ascii="Calibri" w:hAnsi="Calibri"/>
           <w:b w:val="0"/>
-          <w:i w:val="0"/>
-          <w:sz w:val="20"/>
+          <w:sz w:val="18"/>
         </w:rPr>
-        <w:t>Programme : S1 fondations &amp; production de contenus ; S1 diffusion multi-plateformes ; S2 animation, crise, KPIs ; S2 mise en situation ANPER (plan 30/60/90 + restitution).</w:t>
+        <w:t>Programme mixte : S1 présentiel (fondations &amp; contenus) ; S1 visio (diffusion multi-plateformes) ; S2 présentiel (animation, crise, KPIs) ; S2 mixte (mise en situation ANPER + restitution).</w:t>
       </w:r>
     </w:p>
     <w:p>
       <w:pPr>
-        <w:spacing w:before="120" w:after="120"/>
+        <w:spacing w:before="80" w:after="80"/>
       </w:pPr>
       <w:r>
         <w:rPr>
           <w:rFonts w:ascii="Calibri" w:hAnsi="Calibri"/>
           <w:b w:val="0"/>
-          <w:i w:val="0"/>
           <w:color w:val="555555"/>
-          <w:sz w:val="18"/>
+          <w:sz w:val="16"/>
         </w:rPr>
-        <w:t>Hypothèses : billets d’avion A/R non inclus ; déjeuners/dîners non inclus ; présentiel Lomé ; 1 participant ; offre valable 30 jours.</w:t>
-      </w:r>
-    </w:p>
-    <w:p>
-      <w:pPr>
-        <w:spacing w:before="160" w:after="120"/>
-      </w:pPr>
-      <w:r>
-        <w:rPr>
-          <w:rFonts w:ascii="Arial" w:hAnsi="Arial"/>
-          <w:b w:val="0"/>
-          <w:i w:val="0"/>
-          <w:sz w:val="20"/>
-        </w:rPr>
-        <w:t>Arrêtée à la somme de un million huit cent cinquante mille (1 850 000) francs CFA TTC, ISB (2%) inclus et prélevé à la source.</w:t>
+        <w:t>Inclus : formation mixte, supports, plateforme, hébergement, petit-déj., déjeuners &amp; dîners, suivi 30 j. Non inclus : billets d’avion A/R. Offre valable 30 jours.</w:t>
       </w:r>
     </w:p>
     <w:p>
@@ -1062,10 +1050,22 @@
       </w:pPr>
       <w:r>
         <w:rPr>
+          <w:rFonts w:ascii="Arial" w:hAnsi="Arial"/>
+          <w:b w:val="0"/>
+          <w:sz w:val="18"/>
+        </w:rPr>
+        <w:t>Arrêtée à la somme de trois millions cinq cent mille (3 500 000) francs CFA TTC, ISB (2%) inclus et prélevé à la source.</w:t>
+      </w:r>
+    </w:p>
+    <w:p>
+      <w:pPr>
+        <w:spacing w:before="80" w:after="60"/>
+      </w:pPr>
+      <w:r>
+        <w:rPr>
           <w:rFonts w:ascii="Calibri" w:hAnsi="Calibri"/>
           <w:b/>
-          <w:i w:val="0"/>
-          <w:sz w:val="28"/>
+          <w:sz w:val="26"/>
         </w:rPr>
         <w:t>Compte: SONIBANK</w:t>
       </w:r>
@@ -1084,15 +1084,15 @@
         </w:tblBorders>
       </w:tblPr>
       <w:tblGrid>
-        <w:gridCol w:w="2523"/>
-        <w:gridCol w:w="2523"/>
-        <w:gridCol w:w="2523"/>
-        <w:gridCol w:w="2523"/>
+        <w:gridCol w:w="2551"/>
+        <w:gridCol w:w="2551"/>
+        <w:gridCol w:w="2551"/>
+        <w:gridCol w:w="2551"/>
       </w:tblGrid>
       <w:tr>
         <w:tc>
           <w:tcPr>
-            <w:tcW w:type="dxa" w:w="2523"/>
+            <w:tcW w:type="dxa" w:w="2551"/>
           </w:tcPr>
           <w:p>
             <w:pPr>
@@ -1104,8 +1104,7 @@
               <w:rPr>
                 <w:rFonts w:ascii="Calibri" w:hAnsi="Calibri"/>
                 <w:b w:val="0"/>
-                <w:i w:val="0"/>
-                <w:sz w:val="22"/>
+                <w:sz w:val="20"/>
               </w:rPr>
               <w:t>Code banque</w:t>
             </w:r>
@@ -1113,7 +1112,7 @@
         </w:tc>
         <w:tc>
           <w:tcPr>
-            <w:tcW w:type="dxa" w:w="2523"/>
+            <w:tcW w:type="dxa" w:w="2551"/>
           </w:tcPr>
           <w:p>
             <w:pPr>
@@ -1125,8 +1124,7 @@
               <w:rPr>
                 <w:rFonts w:ascii="Calibri" w:hAnsi="Calibri"/>
                 <w:b w:val="0"/>
-                <w:i w:val="0"/>
-                <w:sz w:val="22"/>
+                <w:sz w:val="20"/>
               </w:rPr>
               <w:t>Code guichet</w:t>
             </w:r>
@@ -1134,7 +1132,7 @@
         </w:tc>
         <w:tc>
           <w:tcPr>
-            <w:tcW w:type="dxa" w:w="2523"/>
+            <w:tcW w:type="dxa" w:w="2551"/>
           </w:tcPr>
           <w:p>
             <w:pPr>
@@ -1146,8 +1144,7 @@
               <w:rPr>
                 <w:rFonts w:ascii="Calibri" w:hAnsi="Calibri"/>
                 <w:b w:val="0"/>
-                <w:i w:val="0"/>
-                <w:sz w:val="22"/>
+                <w:sz w:val="20"/>
               </w:rPr>
               <w:t>N° Compte</w:t>
             </w:r>
@@ -1155,7 +1152,7 @@
         </w:tc>
         <w:tc>
           <w:tcPr>
-            <w:tcW w:type="dxa" w:w="2523"/>
+            <w:tcW w:type="dxa" w:w="2551"/>
           </w:tcPr>
           <w:p>
             <w:pPr>
@@ -1167,8 +1164,7 @@
               <w:rPr>
                 <w:rFonts w:ascii="Calibri" w:hAnsi="Calibri"/>
                 <w:b w:val="0"/>
-                <w:i w:val="0"/>
-                <w:sz w:val="22"/>
+                <w:sz w:val="20"/>
               </w:rPr>
               <w:t>Clé RIB</w:t>
             </w:r>
@@ -1178,11 +1174,11 @@
       <w:tr>
         <w:tc>
           <w:tcPr>
-            <w:tcW w:type="dxa" w:w="2523"/>
+            <w:tcW w:type="dxa" w:w="2551"/>
           </w:tcPr>
           <w:p>
             <w:pPr>
-              <w:spacing w:before="40" w:after="120"/>
+              <w:spacing w:before="40" w:after="80"/>
               <w:jc w:val="center"/>
             </w:pPr>
             <w:r/>
@@ -1190,8 +1186,7 @@
               <w:rPr>
                 <w:rFonts w:ascii="Calibri" w:hAnsi="Calibri"/>
                 <w:b w:val="0"/>
-                <w:i w:val="0"/>
-                <w:sz w:val="22"/>
+                <w:sz w:val="20"/>
               </w:rPr>
               <w:t>NE064</w:t>
             </w:r>
@@ -1199,11 +1194,11 @@
         </w:tc>
         <w:tc>
           <w:tcPr>
-            <w:tcW w:type="dxa" w:w="2523"/>
+            <w:tcW w:type="dxa" w:w="2551"/>
           </w:tcPr>
           <w:p>
             <w:pPr>
-              <w:spacing w:before="40" w:after="120"/>
+              <w:spacing w:before="40" w:after="80"/>
               <w:jc w:val="center"/>
             </w:pPr>
             <w:r/>
@@ -1211,8 +1206,7 @@
               <w:rPr>
                 <w:rFonts w:ascii="Calibri" w:hAnsi="Calibri"/>
                 <w:b w:val="0"/>
-                <w:i w:val="0"/>
-                <w:sz w:val="22"/>
+                <w:sz w:val="20"/>
               </w:rPr>
               <w:t>01001</w:t>
             </w:r>
@@ -1220,11 +1214,11 @@
         </w:tc>
         <w:tc>
           <w:tcPr>
-            <w:tcW w:type="dxa" w:w="2523"/>
+            <w:tcW w:type="dxa" w:w="2551"/>
           </w:tcPr>
           <w:p>
             <w:pPr>
-              <w:spacing w:before="40" w:after="120"/>
+              <w:spacing w:before="40" w:after="80"/>
               <w:jc w:val="center"/>
             </w:pPr>
             <w:r/>
@@ -1232,8 +1226,7 @@
               <w:rPr>
                 <w:rFonts w:ascii="Calibri" w:hAnsi="Calibri"/>
                 <w:b w:val="0"/>
-                <w:i w:val="0"/>
-                <w:sz w:val="22"/>
+                <w:sz w:val="20"/>
               </w:rPr>
               <w:t>25112911331</w:t>
             </w:r>
@@ -1241,11 +1234,11 @@
         </w:tc>
         <w:tc>
           <w:tcPr>
-            <w:tcW w:type="dxa" w:w="2523"/>
+            <w:tcW w:type="dxa" w:w="2551"/>
           </w:tcPr>
           <w:p>
             <w:pPr>
-              <w:spacing w:before="40" w:after="120"/>
+              <w:spacing w:before="40" w:after="80"/>
               <w:jc w:val="center"/>
             </w:pPr>
             <w:r/>
@@ -1253,8 +1246,7 @@
               <w:rPr>
                 <w:rFonts w:ascii="Calibri" w:hAnsi="Calibri"/>
                 <w:b w:val="0"/>
-                <w:i w:val="0"/>
-                <w:sz w:val="22"/>
+                <w:sz w:val="20"/>
               </w:rPr>
               <w:t>35</w:t>
             </w:r>
@@ -1276,30 +1268,30 @@
         </w:tblBorders>
       </w:tblPr>
       <w:tblGrid>
-        <w:gridCol w:w="5046"/>
-        <w:gridCol w:w="5046"/>
+        <w:gridCol w:w="5103"/>
+        <w:gridCol w:w="5103"/>
       </w:tblGrid>
       <w:tr>
         <w:tc>
           <w:tcPr>
-            <w:tcW w:type="dxa" w:w="5046"/>
+            <w:tcW w:type="dxa" w:w="5103"/>
           </w:tcPr>
           <w:p/>
         </w:tc>
         <w:tc>
           <w:tcPr>
-            <w:tcW w:type="dxa" w:w="5046"/>
+            <w:tcW w:type="dxa" w:w="5103"/>
           </w:tcPr>
           <w:p>
             <w:pPr>
-              <w:spacing w:before="160" w:after="0"/>
+              <w:spacing w:before="120" w:after="0"/>
               <w:jc w:val="right"/>
             </w:pPr>
             <w:r/>
             <w:r>
               <w:drawing>
                 <wp:inline xmlns:a="http://schemas.openxmlformats.org/drawingml/2006/main" xmlns:pic="http://schemas.openxmlformats.org/drawingml/2006/picture">
-                  <wp:extent cx="1080000" cy="1129693"/>
+                  <wp:extent cx="1007999" cy="1054379"/>
                   <wp:docPr id="2" name="Picture 2"/>
                   <wp:cNvGraphicFramePr>
                     <a:graphicFrameLocks noChangeAspect="1"/>
@@ -1320,7 +1312,7 @@
                         <pic:spPr>
                           <a:xfrm>
                             <a:off x="0" y="0"/>
-                            <a:ext cx="1080000" cy="1129693"/>
+                            <a:ext cx="1007999" cy="1054379"/>
                           </a:xfrm>
                           <a:prstGeom prst="rect"/>
                         </pic:spPr>
@@ -1336,7 +1328,7 @@
             <w:r>
               <w:drawing>
                 <wp:inline xmlns:a="http://schemas.openxmlformats.org/drawingml/2006/main" xmlns:pic="http://schemas.openxmlformats.org/drawingml/2006/picture">
-                  <wp:extent cx="648000" cy="864000"/>
+                  <wp:extent cx="612000" cy="816000"/>
                   <wp:docPr id="3" name="Picture 3"/>
                   <wp:cNvGraphicFramePr>
                     <a:graphicFrameLocks noChangeAspect="1"/>
@@ -1357,7 +1349,7 @@
                         <pic:spPr>
                           <a:xfrm>
                             <a:off x="0" y="0"/>
-                            <a:ext cx="648000" cy="864000"/>
+                            <a:ext cx="612000" cy="816000"/>
                           </a:xfrm>
                           <a:prstGeom prst="rect"/>
                         </pic:spPr>
@@ -1373,7 +1365,7 @@
     </w:tbl>
     <w:sectPr>
       <w:pgSz w:w="11906" w:h="16838"/>
-      <w:pgMar w:top="680" w:right="907" w:bottom="1247" w:left="907" w:header="720" w:footer="720" w:gutter="0"/>
+      <w:pgMar w:top="624" w:right="850" w:bottom="1134" w:left="850" w:header="720" w:footer="720" w:gutter="0"/>
       <w:cols w:space="720"/>
       <w:docGrid w:linePitch="360"/>
     </w:sectPr>

</xml_diff>

<commit_message>
Simplifie l'offre ANPER : IA, infographie, forfait unique
Ajoute outils IA, infographie et gestion de contenu ; retire
hébergement/restauration ; affiche un montant forfaitaire unique.

Co-authored-by: NigerCertify-offensive-lab <openaiabou@gmail.com>
</commit_message>
<xml_diff>
--- a/offres/proposition-formation-anper-community-manager.docx
+++ b/offres/proposition-formation-anper-community-manager.docx
@@ -177,7 +177,7 @@
     </w:tbl>
     <w:p>
       <w:pPr>
-        <w:spacing w:before="80" w:after="40"/>
+        <w:spacing w:before="120" w:after="40"/>
       </w:pPr>
       <w:r>
         <w:rPr>
@@ -191,7 +191,7 @@
     </w:p>
     <w:p>
       <w:pPr>
-        <w:spacing w:before="160" w:after="40"/>
+        <w:spacing w:before="200" w:after="40"/>
         <w:jc w:val="center"/>
       </w:pPr>
       <w:r>
@@ -206,7 +206,7 @@
     </w:p>
     <w:p>
       <w:pPr>
-        <w:spacing w:before="0" w:after="160"/>
+        <w:spacing w:before="0" w:after="200"/>
         <w:jc w:val="center"/>
       </w:pPr>
       <w:r>
@@ -216,353 +216,8 @@
           <w:color w:val="00224B"/>
           <w:sz w:val="20"/>
         </w:rPr>
-        <w:t>1 participant · Mixte (présentiel Lomé + visio) · Hébergement &amp; restauration inclus · 15–26/09/2026</w:t>
+        <w:t>1 participant · Mixte (présentiel Lomé + visio) · 15–26/09/2026</w:t>
       </w:r>
-    </w:p>
-    <w:tbl>
-      <w:tblPr>
-        <w:tblW w:type="auto" w:w="0"/>
-        <w:tblLook w:firstColumn="1" w:firstRow="1" w:lastColumn="0" w:lastRow="0" w:noHBand="0" w:noVBand="1" w:val="04A0"/>
-        <w:tblBorders>
-          <w:top w:val="nil"/>
-          <w:left w:val="nil"/>
-          <w:bottom w:val="nil"/>
-          <w:right w:val="nil"/>
-          <w:insideH w:val="nil"/>
-          <w:insideV w:val="nil"/>
-        </w:tblBorders>
-      </w:tblPr>
-      <w:tblGrid>
-        <w:gridCol w:w="2551"/>
-        <w:gridCol w:w="2551"/>
-        <w:gridCol w:w="2551"/>
-        <w:gridCol w:w="2551"/>
-      </w:tblGrid>
-      <w:tr>
-        <w:tc>
-          <w:tcPr>
-            <w:tcW w:type="dxa" w:w="2551"/>
-          </w:tcPr>
-          <w:p>
-            <w:pPr>
-              <w:spacing w:before="20" w:after="20"/>
-            </w:pPr>
-            <w:r/>
-            <w:r>
-              <w:rPr>
-                <w:rFonts w:ascii="Calibri" w:hAnsi="Calibri"/>
-                <w:b/>
-                <w:color w:val="00224B"/>
-                <w:sz w:val="18"/>
-              </w:rPr>
-              <w:t>Profil:</w:t>
-            </w:r>
-          </w:p>
-        </w:tc>
-        <w:tc>
-          <w:tcPr>
-            <w:tcW w:type="dxa" w:w="2551"/>
-          </w:tcPr>
-          <w:p>
-            <w:pPr>
-              <w:spacing w:before="20" w:after="20"/>
-            </w:pPr>
-            <w:r/>
-            <w:r>
-              <w:rPr>
-                <w:rFonts w:ascii="Calibri" w:hAnsi="Calibri"/>
-                <w:b w:val="0"/>
-                <w:sz w:val="18"/>
-              </w:rPr>
-              <w:t>Community Manager</w:t>
-            </w:r>
-          </w:p>
-        </w:tc>
-        <w:tc>
-          <w:tcPr>
-            <w:tcW w:type="dxa" w:w="2551"/>
-          </w:tcPr>
-          <w:p>
-            <w:pPr>
-              <w:spacing w:before="20" w:after="20"/>
-            </w:pPr>
-            <w:r/>
-            <w:r>
-              <w:rPr>
-                <w:rFonts w:ascii="Calibri" w:hAnsi="Calibri"/>
-                <w:b/>
-                <w:color w:val="00224B"/>
-                <w:sz w:val="18"/>
-              </w:rPr>
-              <w:t>Effectif:</w:t>
-            </w:r>
-          </w:p>
-        </w:tc>
-        <w:tc>
-          <w:tcPr>
-            <w:tcW w:type="dxa" w:w="2551"/>
-          </w:tcPr>
-          <w:p>
-            <w:pPr>
-              <w:spacing w:before="20" w:after="20"/>
-            </w:pPr>
-            <w:r/>
-            <w:r>
-              <w:rPr>
-                <w:rFonts w:ascii="Calibri" w:hAnsi="Calibri"/>
-                <w:b w:val="0"/>
-                <w:sz w:val="18"/>
-              </w:rPr>
-              <w:t>1 personne</w:t>
-            </w:r>
-          </w:p>
-        </w:tc>
-      </w:tr>
-      <w:tr>
-        <w:tc>
-          <w:tcPr>
-            <w:tcW w:type="dxa" w:w="2551"/>
-          </w:tcPr>
-          <w:p>
-            <w:pPr>
-              <w:spacing w:before="20" w:after="20"/>
-            </w:pPr>
-            <w:r/>
-            <w:r>
-              <w:rPr>
-                <w:rFonts w:ascii="Calibri" w:hAnsi="Calibri"/>
-                <w:b/>
-                <w:color w:val="00224B"/>
-                <w:sz w:val="18"/>
-              </w:rPr>
-              <w:t>Durée:</w:t>
-            </w:r>
-          </w:p>
-        </w:tc>
-        <w:tc>
-          <w:tcPr>
-            <w:tcW w:type="dxa" w:w="2551"/>
-          </w:tcPr>
-          <w:p>
-            <w:pPr>
-              <w:spacing w:before="20" w:after="20"/>
-            </w:pPr>
-            <w:r/>
-            <w:r>
-              <w:rPr>
-                <w:rFonts w:ascii="Calibri" w:hAnsi="Calibri"/>
-                <w:b w:val="0"/>
-                <w:sz w:val="18"/>
-              </w:rPr>
-              <w:t>2 semaines / 70 h</w:t>
-            </w:r>
-          </w:p>
-        </w:tc>
-        <w:tc>
-          <w:tcPr>
-            <w:tcW w:type="dxa" w:w="2551"/>
-          </w:tcPr>
-          <w:p>
-            <w:pPr>
-              <w:spacing w:before="20" w:after="20"/>
-            </w:pPr>
-            <w:r/>
-            <w:r>
-              <w:rPr>
-                <w:rFonts w:ascii="Calibri" w:hAnsi="Calibri"/>
-                <w:b/>
-                <w:color w:val="00224B"/>
-                <w:sz w:val="18"/>
-              </w:rPr>
-              <w:t>Modalité:</w:t>
-            </w:r>
-          </w:p>
-        </w:tc>
-        <w:tc>
-          <w:tcPr>
-            <w:tcW w:type="dxa" w:w="2551"/>
-          </w:tcPr>
-          <w:p>
-            <w:pPr>
-              <w:spacing w:before="20" w:after="20"/>
-            </w:pPr>
-            <w:r/>
-            <w:r>
-              <w:rPr>
-                <w:rFonts w:ascii="Calibri" w:hAnsi="Calibri"/>
-                <w:b w:val="0"/>
-                <w:sz w:val="18"/>
-              </w:rPr>
-              <w:t>Mixte</w:t>
-            </w:r>
-          </w:p>
-        </w:tc>
-      </w:tr>
-      <w:tr>
-        <w:tc>
-          <w:tcPr>
-            <w:tcW w:type="dxa" w:w="2551"/>
-          </w:tcPr>
-          <w:p>
-            <w:pPr>
-              <w:spacing w:before="20" w:after="20"/>
-            </w:pPr>
-            <w:r/>
-            <w:r>
-              <w:rPr>
-                <w:rFonts w:ascii="Calibri" w:hAnsi="Calibri"/>
-                <w:b/>
-                <w:color w:val="00224B"/>
-                <w:sz w:val="18"/>
-              </w:rPr>
-              <w:t>Lieu présentiel:</w:t>
-            </w:r>
-          </w:p>
-        </w:tc>
-        <w:tc>
-          <w:tcPr>
-            <w:tcW w:type="dxa" w:w="2551"/>
-          </w:tcPr>
-          <w:p>
-            <w:pPr>
-              <w:spacing w:before="20" w:after="20"/>
-            </w:pPr>
-            <w:r/>
-            <w:r>
-              <w:rPr>
-                <w:rFonts w:ascii="Calibri" w:hAnsi="Calibri"/>
-                <w:b w:val="0"/>
-                <w:sz w:val="18"/>
-              </w:rPr>
-              <w:t>Lomé, Togo</w:t>
-            </w:r>
-          </w:p>
-        </w:tc>
-        <w:tc>
-          <w:tcPr>
-            <w:tcW w:type="dxa" w:w="2551"/>
-          </w:tcPr>
-          <w:p>
-            <w:pPr>
-              <w:spacing w:before="20" w:after="20"/>
-            </w:pPr>
-            <w:r/>
-            <w:r>
-              <w:rPr>
-                <w:rFonts w:ascii="Calibri" w:hAnsi="Calibri"/>
-                <w:b/>
-                <w:color w:val="00224B"/>
-                <w:sz w:val="18"/>
-              </w:rPr>
-              <w:t>Début / Fin:</w:t>
-            </w:r>
-          </w:p>
-        </w:tc>
-        <w:tc>
-          <w:tcPr>
-            <w:tcW w:type="dxa" w:w="2551"/>
-          </w:tcPr>
-          <w:p>
-            <w:pPr>
-              <w:spacing w:before="20" w:after="20"/>
-            </w:pPr>
-            <w:r/>
-            <w:r>
-              <w:rPr>
-                <w:rFonts w:ascii="Calibri" w:hAnsi="Calibri"/>
-                <w:b w:val="0"/>
-                <w:sz w:val="18"/>
-              </w:rPr>
-              <w:t>15–26/09/2026</w:t>
-            </w:r>
-          </w:p>
-        </w:tc>
-      </w:tr>
-      <w:tr>
-        <w:tc>
-          <w:tcPr>
-            <w:tcW w:type="dxa" w:w="2551"/>
-          </w:tcPr>
-          <w:p>
-            <w:pPr>
-              <w:spacing w:before="20" w:after="20"/>
-            </w:pPr>
-            <w:r/>
-            <w:r>
-              <w:rPr>
-                <w:rFonts w:ascii="Calibri" w:hAnsi="Calibri"/>
-                <w:b/>
-                <w:color w:val="00224B"/>
-                <w:sz w:val="18"/>
-              </w:rPr>
-              <w:t>Hébergement + repas:</w:t>
-            </w:r>
-          </w:p>
-        </w:tc>
-        <w:tc>
-          <w:tcPr>
-            <w:tcW w:type="dxa" w:w="2551"/>
-          </w:tcPr>
-          <w:p>
-            <w:pPr>
-              <w:spacing w:before="20" w:after="20"/>
-            </w:pPr>
-            <w:r/>
-            <w:r>
-              <w:rPr>
-                <w:rFonts w:ascii="Calibri" w:hAnsi="Calibri"/>
-                <w:b w:val="0"/>
-                <w:sz w:val="18"/>
-              </w:rPr>
-              <w:t>Inclus</w:t>
-            </w:r>
-          </w:p>
-        </w:tc>
-        <w:tc>
-          <w:tcPr>
-            <w:tcW w:type="dxa" w:w="2551"/>
-          </w:tcPr>
-          <w:p>
-            <w:pPr>
-              <w:spacing w:before="20" w:after="20"/>
-            </w:pPr>
-            <w:r/>
-            <w:r>
-              <w:rPr>
-                <w:rFonts w:ascii="Calibri" w:hAnsi="Calibri"/>
-                <w:b/>
-                <w:color w:val="00224B"/>
-                <w:sz w:val="18"/>
-              </w:rPr>
-              <w:t>Vols A/R:</w:t>
-            </w:r>
-          </w:p>
-        </w:tc>
-        <w:tc>
-          <w:tcPr>
-            <w:tcW w:type="dxa" w:w="2551"/>
-          </w:tcPr>
-          <w:p>
-            <w:pPr>
-              <w:spacing w:before="20" w:after="20"/>
-            </w:pPr>
-            <w:r/>
-            <w:r>
-              <w:rPr>
-                <w:rFonts w:ascii="Calibri" w:hAnsi="Calibri"/>
-                <w:b w:val="0"/>
-                <w:sz w:val="18"/>
-              </w:rPr>
-              <w:t>Non inclus</w:t>
-            </w:r>
-          </w:p>
-        </w:tc>
-      </w:tr>
-    </w:tbl>
-    <w:p>
-      <w:pPr>
-        <w:spacing w:before="120" w:after="60"/>
-      </w:pPr>
     </w:p>
     <w:tbl>
       <w:tblPr>
@@ -578,19 +233,17 @@
         </w:tblBorders>
       </w:tblPr>
       <w:tblGrid>
-        <w:gridCol w:w="5103"/>
-        <w:gridCol w:w="5103"/>
+        <w:gridCol w:w="10206"/>
       </w:tblGrid>
       <w:tr>
         <w:tc>
           <w:tcPr>
-            <w:tcW w:type="dxa" w:w="5103"/>
+            <w:tcW w:type="dxa" w:w="10206"/>
             <w:shd w:fill="E46C0A" w:val="clear"/>
           </w:tcPr>
           <w:p>
             <w:pPr>
-              <w:spacing w:before="80" w:after="80"/>
-              <w:jc w:val="left"/>
+              <w:spacing w:before="100" w:after="100"/>
             </w:pPr>
             <w:r/>
             <w:r>
@@ -598,31 +251,9 @@
                 <w:rFonts w:ascii="Calibri" w:hAnsi="Calibri"/>
                 <w:b/>
                 <w:color w:val="FFFFFF"/>
-                <w:sz w:val="22"/>
+                <w:sz w:val="24"/>
               </w:rPr>
-              <w:t>Prestations</w:t>
-            </w:r>
-          </w:p>
-        </w:tc>
-        <w:tc>
-          <w:tcPr>
-            <w:tcW w:type="dxa" w:w="5103"/>
-            <w:shd w:fill="E46C0A" w:val="clear"/>
-          </w:tcPr>
-          <w:p>
-            <w:pPr>
-              <w:spacing w:before="80" w:after="80"/>
-              <w:jc w:val="center"/>
-            </w:pPr>
-            <w:r/>
-            <w:r>
-              <w:rPr>
-                <w:rFonts w:ascii="Calibri" w:hAnsi="Calibri"/>
-                <w:b/>
-                <w:color w:val="FFFFFF"/>
-                <w:sz w:val="22"/>
-              </w:rPr>
-              <w:t>Montant (FCFA)</w:t>
+              <w:t>Périmètre de la formation (forfait)</w:t>
             </w:r>
           </w:p>
         </w:tc>
@@ -630,245 +261,85 @@
       <w:tr>
         <w:tc>
           <w:tcPr>
-            <w:tcW w:type="dxa" w:w="5103"/>
+            <w:tcW w:type="dxa" w:w="10206"/>
           </w:tcPr>
           <w:p>
             <w:pPr>
-              <w:spacing w:before="60" w:after="60"/>
+              <w:spacing w:before="40" w:after="40"/>
             </w:pPr>
             <w:r/>
             <w:r>
               <w:rPr>
                 <w:rFonts w:ascii="Calibri" w:hAnsi="Calibri"/>
                 <w:b w:val="0"/>
-                <w:sz w:val="18"/>
+                <w:sz w:val="20"/>
               </w:rPr>
-              <w:t>Formation Community Manager mixte — 10 jours / 70 h (présentiel Lomé + sessions visio, coaching live)</w:t>
+              <w:t>• Stratégie &amp; animation Community Management (réseaux sociaux, community care, crise, reporting)</w:t>
             </w:r>
           </w:p>
-        </w:tc>
-        <w:tc>
-          <w:tcPr>
-            <w:tcW w:type="dxa" w:w="5103"/>
-          </w:tcPr>
           <w:p>
             <w:pPr>
-              <w:spacing w:before="60" w:after="60"/>
-              <w:jc w:val="right"/>
+              <w:spacing w:before="40" w:after="40"/>
             </w:pPr>
-            <w:r/>
             <w:r>
               <w:rPr>
                 <w:rFonts w:ascii="Calibri" w:hAnsi="Calibri"/>
                 <w:b w:val="0"/>
-                <w:sz w:val="18"/>
+                <w:sz w:val="20"/>
               </w:rPr>
-              <w:t>1 500 000</w:t>
+              <w:t>• Maîtrise des outils d’intelligence artificielle appliqués au CM (idéation, rédaction assistée, optimisation, automatisation)</w:t>
             </w:r>
           </w:p>
-        </w:tc>
-      </w:tr>
-      <w:tr>
-        <w:tc>
-          <w:tcPr>
-            <w:tcW w:type="dxa" w:w="5103"/>
-          </w:tcPr>
           <w:p>
             <w:pPr>
-              <w:spacing w:before="60" w:after="60"/>
+              <w:spacing w:before="40" w:after="40"/>
             </w:pPr>
-            <w:r/>
             <w:r>
               <w:rPr>
                 <w:rFonts w:ascii="Calibri" w:hAnsi="Calibri"/>
                 <w:b w:val="0"/>
-                <w:sz w:val="18"/>
+                <w:sz w:val="20"/>
               </w:rPr>
-              <w:t>Supports pédagogiques, plateforme virtuelle, ateliers pratiques &amp; attestation</w:t>
+              <w:t>• Infographie &amp; création visuelle (Canva / outils graphiques, templates, identité visuelle)</w:t>
             </w:r>
           </w:p>
-        </w:tc>
-        <w:tc>
-          <w:tcPr>
-            <w:tcW w:type="dxa" w:w="5103"/>
-          </w:tcPr>
           <w:p>
             <w:pPr>
-              <w:spacing w:before="60" w:after="60"/>
-              <w:jc w:val="right"/>
+              <w:spacing w:before="40" w:after="40"/>
             </w:pPr>
-            <w:r/>
             <w:r>
               <w:rPr>
                 <w:rFonts w:ascii="Calibri" w:hAnsi="Calibri"/>
                 <w:b w:val="0"/>
-                <w:sz w:val="18"/>
+                <w:sz w:val="20"/>
               </w:rPr>
-              <w:t>250 000</w:t>
+              <w:t>• Gestion du contenu (calendrier éditorial, workflow, bibliothèque, planification &amp; publication)</w:t>
             </w:r>
           </w:p>
-        </w:tc>
-      </w:tr>
-      <w:tr>
-        <w:tc>
-          <w:tcPr>
-            <w:tcW w:type="dxa" w:w="5103"/>
-          </w:tcPr>
           <w:p>
             <w:pPr>
-              <w:spacing w:before="60" w:after="60"/>
+              <w:spacing w:before="40" w:after="40"/>
             </w:pPr>
-            <w:r/>
             <w:r>
               <w:rPr>
                 <w:rFonts w:ascii="Calibri" w:hAnsi="Calibri"/>
                 <w:b w:val="0"/>
-                <w:sz w:val="18"/>
+                <w:sz w:val="20"/>
               </w:rPr>
-              <w:t>Hébergement 14 nuits à Lomé (hôtel affaires, petit-déjeuner inclus)</w:t>
+              <w:t>• Supports pédagogiques, plateforme virtuelle, ateliers pratiques &amp; attestation</w:t>
             </w:r>
           </w:p>
-        </w:tc>
-        <w:tc>
-          <w:tcPr>
-            <w:tcW w:type="dxa" w:w="5103"/>
-          </w:tcPr>
           <w:p>
             <w:pPr>
-              <w:spacing w:before="60" w:after="60"/>
-              <w:jc w:val="right"/>
+              <w:spacing w:before="40" w:after="40"/>
             </w:pPr>
-            <w:r/>
             <w:r>
               <w:rPr>
                 <w:rFonts w:ascii="Calibri" w:hAnsi="Calibri"/>
                 <w:b w:val="0"/>
-                <w:sz w:val="18"/>
+                <w:sz w:val="20"/>
               </w:rPr>
-              <w:t>700 000</w:t>
-            </w:r>
-          </w:p>
-        </w:tc>
-      </w:tr>
-      <w:tr>
-        <w:tc>
-          <w:tcPr>
-            <w:tcW w:type="dxa" w:w="5103"/>
-          </w:tcPr>
-          <w:p>
-            <w:pPr>
-              <w:spacing w:before="60" w:after="60"/>
-            </w:pPr>
-            <w:r/>
-            <w:r>
-              <w:rPr>
-                <w:rFonts w:ascii="Calibri" w:hAnsi="Calibri"/>
-                <w:b w:val="0"/>
-                <w:sz w:val="18"/>
-              </w:rPr>
-              <w:t>Restauration complète (déjeuner + dîner) — 14 jours</w:t>
-            </w:r>
-          </w:p>
-        </w:tc>
-        <w:tc>
-          <w:tcPr>
-            <w:tcW w:type="dxa" w:w="5103"/>
-          </w:tcPr>
-          <w:p>
-            <w:pPr>
-              <w:spacing w:before="60" w:after="60"/>
-              <w:jc w:val="right"/>
-            </w:pPr>
-            <w:r/>
-            <w:r>
-              <w:rPr>
-                <w:rFonts w:ascii="Calibri" w:hAnsi="Calibri"/>
-                <w:b w:val="0"/>
-                <w:sz w:val="18"/>
-              </w:rPr>
-              <w:t>560 000</w:t>
-            </w:r>
-          </w:p>
-        </w:tc>
-      </w:tr>
-      <w:tr>
-        <w:tc>
-          <w:tcPr>
-            <w:tcW w:type="dxa" w:w="5103"/>
-          </w:tcPr>
-          <w:p>
-            <w:pPr>
-              <w:spacing w:before="60" w:after="60"/>
-            </w:pPr>
-            <w:r/>
-            <w:r>
-              <w:rPr>
-                <w:rFonts w:ascii="Calibri" w:hAnsi="Calibri"/>
-                <w:b w:val="0"/>
-                <w:sz w:val="18"/>
-              </w:rPr>
-              <w:t>Coordination pédagogique, logistique locale &amp; suivi post-formation (30 jours)</w:t>
-            </w:r>
-          </w:p>
-        </w:tc>
-        <w:tc>
-          <w:tcPr>
-            <w:tcW w:type="dxa" w:w="5103"/>
-          </w:tcPr>
-          <w:p>
-            <w:pPr>
-              <w:spacing w:before="60" w:after="60"/>
-              <w:jc w:val="right"/>
-            </w:pPr>
-            <w:r/>
-            <w:r>
-              <w:rPr>
-                <w:rFonts w:ascii="Calibri" w:hAnsi="Calibri"/>
-                <w:b w:val="0"/>
-                <w:sz w:val="18"/>
-              </w:rPr>
-              <w:t>490 000</w:t>
-            </w:r>
-          </w:p>
-        </w:tc>
-      </w:tr>
-      <w:tr>
-        <w:tc>
-          <w:tcPr>
-            <w:tcW w:type="dxa" w:w="5103"/>
-          </w:tcPr>
-          <w:p>
-            <w:pPr>
-              <w:spacing w:before="60" w:after="60"/>
-            </w:pPr>
-            <w:r/>
-            <w:r>
-              <w:rPr>
-                <w:rFonts w:ascii="Calibri" w:hAnsi="Calibri"/>
-                <w:b/>
-                <w:sz w:val="18"/>
-              </w:rPr>
-              <w:t>TOTAL TTC</w:t>
-            </w:r>
-          </w:p>
-        </w:tc>
-        <w:tc>
-          <w:tcPr>
-            <w:tcW w:type="dxa" w:w="5103"/>
-          </w:tcPr>
-          <w:p>
-            <w:pPr>
-              <w:spacing w:before="60" w:after="60"/>
-              <w:jc w:val="right"/>
-            </w:pPr>
-            <w:r/>
-            <w:r>
-              <w:rPr>
-                <w:rFonts w:ascii="Calibri" w:hAnsi="Calibri"/>
-                <w:b/>
-                <w:sz w:val="18"/>
-              </w:rPr>
-              <w:t>3 500 000</w:t>
+              <w:t>• Coordination pédagogique &amp; suivi post-formation (30 jours)</w:t>
             </w:r>
           </w:p>
         </w:tc>
@@ -876,7 +347,7 @@
     </w:tbl>
     <w:p>
       <w:pPr>
-        <w:spacing w:before="120" w:after="60"/>
+        <w:spacing w:before="200" w:after="80"/>
       </w:pPr>
     </w:p>
     <w:tbl>
@@ -884,12 +355,12 @@
         <w:tblW w:type="auto" w:w="0"/>
         <w:tblLook w:firstColumn="1" w:firstRow="1" w:lastColumn="0" w:lastRow="0" w:noHBand="0" w:noVBand="1" w:val="04A0"/>
         <w:tblBorders>
-          <w:top w:val="single" w:sz="6" w:color="000000" w:space="0"/>
-          <w:left w:val="single" w:sz="6" w:color="000000" w:space="0"/>
-          <w:bottom w:val="single" w:sz="6" w:color="000000" w:space="0"/>
-          <w:right w:val="single" w:sz="6" w:color="000000" w:space="0"/>
-          <w:insideH w:val="single" w:sz="6" w:color="000000" w:space="0"/>
-          <w:insideV w:val="single" w:sz="6" w:color="000000" w:space="0"/>
+          <w:top w:val="single" w:sz="16" w:color="00224B" w:space="0"/>
+          <w:left w:val="single" w:sz="16" w:color="00224B" w:space="0"/>
+          <w:bottom w:val="single" w:sz="16" w:color="00224B" w:space="0"/>
+          <w:right w:val="single" w:sz="16" w:color="00224B" w:space="0"/>
+          <w:insideH w:val="single" w:sz="16" w:color="00224B" w:space="0"/>
+          <w:insideV w:val="single" w:sz="16" w:color="00224B" w:space="0"/>
         </w:tblBorders>
       </w:tblPr>
       <w:tblGrid>
@@ -903,16 +374,17 @@
           </w:tcPr>
           <w:p>
             <w:pPr>
-              <w:spacing w:before="40" w:after="40"/>
+              <w:spacing w:before="160" w:after="160"/>
             </w:pPr>
             <w:r/>
             <w:r>
               <w:rPr>
                 <w:rFonts w:ascii="Calibri" w:hAnsi="Calibri"/>
                 <w:b/>
-                <w:sz w:val="20"/>
+                <w:color w:val="00224B"/>
+                <w:sz w:val="24"/>
               </w:rPr>
-              <w:t>Montant HT</w:t>
+              <w:t>Montant forfaitaire TTC</w:t>
             </w:r>
           </w:p>
         </w:tc>
@@ -922,96 +394,18 @@
           </w:tcPr>
           <w:p>
             <w:pPr>
-              <w:spacing w:before="40" w:after="40"/>
-            </w:pPr>
-            <w:r/>
-            <w:r>
-              <w:rPr>
-                <w:rFonts w:ascii="Calibri" w:hAnsi="Calibri"/>
-                <w:b w:val="0"/>
-                <w:sz w:val="20"/>
-              </w:rPr>
-              <w:t>3 500 000</w:t>
-            </w:r>
-          </w:p>
-        </w:tc>
-      </w:tr>
-      <w:tr>
-        <w:tc>
-          <w:tcPr>
-            <w:tcW w:type="dxa" w:w="5103"/>
-          </w:tcPr>
-          <w:p>
-            <w:pPr>
-              <w:spacing w:before="40" w:after="40"/>
+              <w:spacing w:before="160" w:after="160"/>
+              <w:jc w:val="right"/>
             </w:pPr>
             <w:r/>
             <w:r>
               <w:rPr>
                 <w:rFonts w:ascii="Calibri" w:hAnsi="Calibri"/>
                 <w:b/>
-                <w:sz w:val="20"/>
+                <w:color w:val="E36C09"/>
+                <w:sz w:val="32"/>
               </w:rPr>
-              <w:t>ISB (2%)</w:t>
-            </w:r>
-          </w:p>
-        </w:tc>
-        <w:tc>
-          <w:tcPr>
-            <w:tcW w:type="dxa" w:w="5103"/>
-          </w:tcPr>
-          <w:p>
-            <w:pPr>
-              <w:spacing w:before="40" w:after="40"/>
-            </w:pPr>
-            <w:r/>
-            <w:r>
-              <w:rPr>
-                <w:rFonts w:ascii="Calibri" w:hAnsi="Calibri"/>
-                <w:b w:val="0"/>
-                <w:sz w:val="20"/>
-              </w:rPr>
-              <w:t>70 000</w:t>
-            </w:r>
-          </w:p>
-        </w:tc>
-      </w:tr>
-      <w:tr>
-        <w:tc>
-          <w:tcPr>
-            <w:tcW w:type="dxa" w:w="5103"/>
-          </w:tcPr>
-          <w:p>
-            <w:pPr>
-              <w:spacing w:before="40" w:after="40"/>
-            </w:pPr>
-            <w:r/>
-            <w:r>
-              <w:rPr>
-                <w:rFonts w:ascii="Calibri" w:hAnsi="Calibri"/>
-                <w:b/>
-                <w:sz w:val="20"/>
-              </w:rPr>
-              <w:t>Net à payer TTC :</w:t>
-            </w:r>
-          </w:p>
-        </w:tc>
-        <w:tc>
-          <w:tcPr>
-            <w:tcW w:type="dxa" w:w="5103"/>
-          </w:tcPr>
-          <w:p>
-            <w:pPr>
-              <w:spacing w:before="40" w:after="40"/>
-            </w:pPr>
-            <w:r/>
-            <w:r>
-              <w:rPr>
-                <w:rFonts w:ascii="Calibri" w:hAnsi="Calibri"/>
-                <w:b/>
-                <w:sz w:val="20"/>
-              </w:rPr>
-              <w:t>3 500 000</w:t>
+              <w:t>3 500 000 FCFA</w:t>
             </w:r>
           </w:p>
         </w:tc>
@@ -1019,7 +413,7 @@
     </w:tbl>
     <w:p>
       <w:pPr>
-        <w:spacing w:before="160" w:after="60"/>
+        <w:spacing w:before="200" w:after="80"/>
       </w:pPr>
       <w:r>
         <w:rPr>
@@ -1027,12 +421,12 @@
           <w:b w:val="0"/>
           <w:sz w:val="18"/>
         </w:rPr>
-        <w:t>Programme mixte : S1 présentiel (fondations &amp; contenus) ; S1 visio (diffusion multi-plateformes) ; S2 présentiel (animation, crise, KPIs) ; S2 mixte (mise en situation ANPER + restitution).</w:t>
+        <w:t>Programme mixte : S1 présentiel (fondations &amp; gestion de contenu) ; S1 mixte (production &amp; outils IA) ; S2 présentiel (infographie &amp; diffusion) ; S2 mixte (pilotage, KPIs, plan 30/60/90 ANPER).</w:t>
       </w:r>
     </w:p>
     <w:p>
       <w:pPr>
-        <w:spacing w:before="80" w:after="80"/>
+        <w:spacing w:before="80" w:after="120"/>
       </w:pPr>
       <w:r>
         <w:rPr>
@@ -1041,20 +435,20 @@
           <w:color w:val="555555"/>
           <w:sz w:val="16"/>
         </w:rPr>
-        <w:t>Inclus : formation mixte, supports, plateforme, hébergement, petit-déj., déjeuners &amp; dîners, suivi 30 j. Non inclus : billets d’avion A/R. Offre valable 30 jours.</w:t>
+        <w:t>Inclus : formation mixte, IA, infographie, gestion de contenu, supports, plateforme, attestation, suivi 30 j. Non inclus : hébergement, restauration, billets d’avion A/R. Offre valable 30 jours.</w:t>
       </w:r>
     </w:p>
     <w:p>
       <w:pPr>
-        <w:spacing w:before="120" w:after="80"/>
+        <w:spacing w:before="120" w:after="120"/>
       </w:pPr>
       <w:r>
         <w:rPr>
           <w:rFonts w:ascii="Arial" w:hAnsi="Arial"/>
           <w:b w:val="0"/>
-          <w:sz w:val="18"/>
+          <w:sz w:val="20"/>
         </w:rPr>
-        <w:t>Arrêtée à la somme de trois millions cinq cent mille (3 500 000) francs CFA TTC, ISB (2%) inclus et prélevé à la source.</w:t>
+        <w:t>Arrêtée à la somme forfaitaire de trois millions cinq cent mille (3 500 000) francs CFA TTC, ISB (2%) inclus et prélevé à la source.</w:t>
       </w:r>
     </w:p>
     <w:p>
@@ -1284,7 +678,7 @@
           </w:tcPr>
           <w:p>
             <w:pPr>
-              <w:spacing w:before="120" w:after="0"/>
+              <w:spacing w:before="160" w:after="0"/>
               <w:jc w:val="right"/>
             </w:pPr>
             <w:r/>
@@ -1365,7 +759,7 @@
     </w:tbl>
     <w:sectPr>
       <w:pgSz w:w="11906" w:h="16838"/>
-      <w:pgMar w:top="624" w:right="850" w:bottom="1134" w:left="850" w:header="720" w:footer="720" w:gutter="0"/>
+      <w:pgMar w:top="680" w:right="850" w:bottom="1134" w:left="850" w:header="720" w:footer="720" w:gutter="0"/>
       <w:cols w:space="720"/>
       <w:docGrid w:linePitch="360"/>
     </w:sectPr>

</xml_diff>